<commit_message>
Update brief with Replit implementation instructions
Added a full section to the Word document explaining the phase files,
the process for using them with Replit (one phase per session, verify
between phases), what can run in parallel, and what to look for when
verifying. The brief is now self-contained — no need to read the README.

Co-Authored-By: Claude Opus 4.6 (1M context) <noreply@anthropic.com>
</commit_message>
<xml_diff>
--- a/docs/Unlock Implementation Brief.docx
+++ b/docs/Unlock Implementation Brief.docx
@@ -5884,6 +5884,1138 @@
           <w:szCs w:val="22"/>
         </w:rPr>
         <w:t xml:space="preserve">All three are in the docs/ folder of the repository.</w:t>
+      </w:r>
+    </w:p>
+    <w:p>
+      <w:r>
+        <w:br w:type="page"/>
+      </w:r>
+    </w:p>
+    <w:p>
+      <w:pPr>
+        <w:pStyle w:val="Heading1"/>
+        <w:spacing w:after="160" w:before="360"/>
+      </w:pPr>
+      <w:r>
+        <w:rPr>
+          <w:rFonts w:ascii="Arial" w:cs="Arial" w:eastAsia="Arial" w:hAnsi="Arial"/>
+          <w:b/>
+          <w:bCs/>
+          <w:sz w:val="32"/>
+          <w:szCs w:val="32"/>
+        </w:rPr>
+        <w:t xml:space="preserve">How to implement this with Replit</w:t>
+      </w:r>
+    </w:p>
+    <w:p>
+      <w:pPr>
+        <w:spacing w:after="160"/>
+        <w:jc w:val="left"/>
+      </w:pPr>
+      <w:r>
+        <w:rPr>
+          <w:rFonts w:ascii="Arial" w:cs="Arial" w:eastAsia="Arial" w:hAnsi="Arial"/>
+          <w:sz w:val="22"/>
+          <w:szCs w:val="22"/>
+        </w:rPr>
+        <w:t xml:space="preserve">The work has been broken into five self-contained specification files, one per phase. Each file defines what the feature must do, the acceptance criteria to verify it, and the constraints to follow. They do not contain code snippets or file edit instructions — Replit figures out the implementation; you verify the output.</w:t>
+      </w:r>
+    </w:p>
+    <w:p>
+      <w:pPr>
+        <w:spacing w:after="160"/>
+        <w:jc w:val="left"/>
+      </w:pPr>
+      <w:r>
+        <w:rPr>
+          <w:rFonts w:ascii="Arial" w:cs="Arial" w:eastAsia="Arial" w:hAnsi="Arial"/>
+          <w:sz w:val="22"/>
+          <w:szCs w:val="22"/>
+        </w:rPr>
+        <w:t xml:space="preserve">The files are in the repository under docs/phases/:</w:t>
+      </w:r>
+    </w:p>
+    <w:tbl>
+      <w:tblPr>
+        <w:tblW w:type="dxa" w:w="9360"/>
+        <w:tblBorders>
+          <w:top w:val="single" w:color="auto" w:sz="4"/>
+          <w:left w:val="single" w:color="auto" w:sz="4"/>
+          <w:bottom w:val="single" w:color="auto" w:sz="4"/>
+          <w:right w:val="single" w:color="auto" w:sz="4"/>
+          <w:insideH w:val="single" w:color="auto" w:sz="4"/>
+          <w:insideV w:val="single" w:color="auto" w:sz="4"/>
+        </w:tblBorders>
+      </w:tblPr>
+      <w:tblGrid>
+        <w:gridCol w:w="3600"/>
+        <w:gridCol w:w="1200"/>
+        <w:gridCol w:w="2000"/>
+        <w:gridCol w:w="2560"/>
+      </w:tblGrid>
+      <w:tr>
+        <w:tc>
+          <w:tcPr>
+            <w:tcW w:type="dxa" w:w="3600"/>
+            <w:tcBorders>
+              <w:top w:val="single" w:color="CCCCCC" w:sz="1"/>
+              <w:left w:val="single" w:color="CCCCCC" w:sz="1"/>
+              <w:bottom w:val="single" w:color="CCCCCC" w:sz="1"/>
+              <w:right w:val="single" w:color="CCCCCC" w:sz="1"/>
+            </w:tcBorders>
+            <w:shd w:fill="E8F5E9" w:val="clear"/>
+            <w:tcMar>
+              <w:top w:type="dxa" w:w="80"/>
+              <w:left w:type="dxa" w:w="120"/>
+              <w:bottom w:type="dxa" w:w="80"/>
+              <w:right w:type="dxa" w:w="120"/>
+            </w:tcMar>
+          </w:tcPr>
+          <w:p>
+            <w:pPr>
+              <w:jc w:val="left"/>
+            </w:pPr>
+            <w:r>
+              <w:rPr>
+                <w:rFonts w:ascii="Arial" w:cs="Arial" w:eastAsia="Arial" w:hAnsi="Arial"/>
+                <w:b/>
+                <w:bCs/>
+                <w:sz w:val="22"/>
+                <w:szCs w:val="22"/>
+              </w:rPr>
+              <w:t xml:space="preserve">File</w:t>
+            </w:r>
+          </w:p>
+        </w:tc>
+        <w:tc>
+          <w:tcPr>
+            <w:tcW w:type="dxa" w:w="1200"/>
+            <w:tcBorders>
+              <w:top w:val="single" w:color="CCCCCC" w:sz="1"/>
+              <w:left w:val="single" w:color="CCCCCC" w:sz="1"/>
+              <w:bottom w:val="single" w:color="CCCCCC" w:sz="1"/>
+              <w:right w:val="single" w:color="CCCCCC" w:sz="1"/>
+            </w:tcBorders>
+            <w:shd w:fill="E8F5E9" w:val="clear"/>
+            <w:tcMar>
+              <w:top w:type="dxa" w:w="80"/>
+              <w:left w:type="dxa" w:w="120"/>
+              <w:bottom w:type="dxa" w:w="80"/>
+              <w:right w:type="dxa" w:w="120"/>
+            </w:tcMar>
+          </w:tcPr>
+          <w:p>
+            <w:pPr>
+              <w:jc w:val="left"/>
+            </w:pPr>
+            <w:r>
+              <w:rPr>
+                <w:rFonts w:ascii="Arial" w:cs="Arial" w:eastAsia="Arial" w:hAnsi="Arial"/>
+                <w:b/>
+                <w:bCs/>
+                <w:sz w:val="22"/>
+                <w:szCs w:val="22"/>
+              </w:rPr>
+              <w:t xml:space="preserve">Effort</w:t>
+            </w:r>
+          </w:p>
+        </w:tc>
+        <w:tc>
+          <w:tcPr>
+            <w:tcW w:type="dxa" w:w="2000"/>
+            <w:tcBorders>
+              <w:top w:val="single" w:color="CCCCCC" w:sz="1"/>
+              <w:left w:val="single" w:color="CCCCCC" w:sz="1"/>
+              <w:bottom w:val="single" w:color="CCCCCC" w:sz="1"/>
+              <w:right w:val="single" w:color="CCCCCC" w:sz="1"/>
+            </w:tcBorders>
+            <w:shd w:fill="E8F5E9" w:val="clear"/>
+            <w:tcMar>
+              <w:top w:type="dxa" w:w="80"/>
+              <w:left w:type="dxa" w:w="120"/>
+              <w:bottom w:type="dxa" w:w="80"/>
+              <w:right w:type="dxa" w:w="120"/>
+            </w:tcMar>
+          </w:tcPr>
+          <w:p>
+            <w:pPr>
+              <w:jc w:val="left"/>
+            </w:pPr>
+            <w:r>
+              <w:rPr>
+                <w:rFonts w:ascii="Arial" w:cs="Arial" w:eastAsia="Arial" w:hAnsi="Arial"/>
+                <w:b/>
+                <w:bCs/>
+                <w:sz w:val="22"/>
+                <w:szCs w:val="22"/>
+              </w:rPr>
+              <w:t xml:space="preserve">Depends on</w:t>
+            </w:r>
+          </w:p>
+        </w:tc>
+        <w:tc>
+          <w:tcPr>
+            <w:tcW w:type="dxa" w:w="2560"/>
+            <w:tcBorders>
+              <w:top w:val="single" w:color="CCCCCC" w:sz="1"/>
+              <w:left w:val="single" w:color="CCCCCC" w:sz="1"/>
+              <w:bottom w:val="single" w:color="CCCCCC" w:sz="1"/>
+              <w:right w:val="single" w:color="CCCCCC" w:sz="1"/>
+            </w:tcBorders>
+            <w:shd w:fill="E8F5E9" w:val="clear"/>
+            <w:tcMar>
+              <w:top w:type="dxa" w:w="80"/>
+              <w:left w:type="dxa" w:w="120"/>
+              <w:bottom w:type="dxa" w:w="80"/>
+              <w:right w:type="dxa" w:w="120"/>
+            </w:tcMar>
+          </w:tcPr>
+          <w:p>
+            <w:pPr>
+              <w:jc w:val="left"/>
+            </w:pPr>
+            <w:r>
+              <w:rPr>
+                <w:rFonts w:ascii="Arial" w:cs="Arial" w:eastAsia="Arial" w:hAnsi="Arial"/>
+                <w:b/>
+                <w:bCs/>
+                <w:sz w:val="22"/>
+                <w:szCs w:val="22"/>
+              </w:rPr>
+              <w:t xml:space="preserve">What it covers</w:t>
+            </w:r>
+          </w:p>
+        </w:tc>
+      </w:tr>
+      <w:tr>
+        <w:tc>
+          <w:tcPr>
+            <w:tcW w:type="dxa" w:w="3600"/>
+            <w:tcBorders>
+              <w:top w:val="single" w:color="CCCCCC" w:sz="1"/>
+              <w:left w:val="single" w:color="CCCCCC" w:sz="1"/>
+              <w:bottom w:val="single" w:color="CCCCCC" w:sz="1"/>
+              <w:right w:val="single" w:color="CCCCCC" w:sz="1"/>
+            </w:tcBorders>
+            <w:tcMar>
+              <w:top w:type="dxa" w:w="80"/>
+              <w:left w:type="dxa" w:w="120"/>
+              <w:bottom w:type="dxa" w:w="80"/>
+              <w:right w:type="dxa" w:w="120"/>
+            </w:tcMar>
+          </w:tcPr>
+          <w:p>
+            <w:pPr>
+              <w:jc w:val="left"/>
+            </w:pPr>
+            <w:r>
+              <w:rPr>
+                <w:rFonts w:ascii="Arial" w:cs="Arial" w:eastAsia="Arial" w:hAnsi="Arial"/>
+                <w:b w:val="false"/>
+                <w:bCs w:val="false"/>
+                <w:sz w:val="22"/>
+                <w:szCs w:val="22"/>
+              </w:rPr>
+              <w:t xml:space="preserve">PHASE-1-asset-growth-defaults.md</w:t>
+            </w:r>
+          </w:p>
+        </w:tc>
+        <w:tc>
+          <w:tcPr>
+            <w:tcW w:type="dxa" w:w="1200"/>
+            <w:tcBorders>
+              <w:top w:val="single" w:color="CCCCCC" w:sz="1"/>
+              <w:left w:val="single" w:color="CCCCCC" w:sz="1"/>
+              <w:bottom w:val="single" w:color="CCCCCC" w:sz="1"/>
+              <w:right w:val="single" w:color="CCCCCC" w:sz="1"/>
+            </w:tcBorders>
+            <w:tcMar>
+              <w:top w:type="dxa" w:w="80"/>
+              <w:left w:type="dxa" w:w="120"/>
+              <w:bottom w:type="dxa" w:w="80"/>
+              <w:right w:type="dxa" w:w="120"/>
+            </w:tcMar>
+          </w:tcPr>
+          <w:p>
+            <w:pPr>
+              <w:jc w:val="left"/>
+            </w:pPr>
+            <w:r>
+              <w:rPr>
+                <w:rFonts w:ascii="Arial" w:cs="Arial" w:eastAsia="Arial" w:hAnsi="Arial"/>
+                <w:b w:val="false"/>
+                <w:bCs w:val="false"/>
+                <w:sz w:val="22"/>
+                <w:szCs w:val="22"/>
+              </w:rPr>
+              <w:t xml:space="preserve">Half a day</w:t>
+            </w:r>
+          </w:p>
+        </w:tc>
+        <w:tc>
+          <w:tcPr>
+            <w:tcW w:type="dxa" w:w="2000"/>
+            <w:tcBorders>
+              <w:top w:val="single" w:color="CCCCCC" w:sz="1"/>
+              <w:left w:val="single" w:color="CCCCCC" w:sz="1"/>
+              <w:bottom w:val="single" w:color="CCCCCC" w:sz="1"/>
+              <w:right w:val="single" w:color="CCCCCC" w:sz="1"/>
+            </w:tcBorders>
+            <w:tcMar>
+              <w:top w:type="dxa" w:w="80"/>
+              <w:left w:type="dxa" w:w="120"/>
+              <w:bottom w:type="dxa" w:w="80"/>
+              <w:right w:type="dxa" w:w="120"/>
+            </w:tcMar>
+          </w:tcPr>
+          <w:p>
+            <w:pPr>
+              <w:jc w:val="left"/>
+            </w:pPr>
+            <w:r>
+              <w:rPr>
+                <w:rFonts w:ascii="Arial" w:cs="Arial" w:eastAsia="Arial" w:hAnsi="Arial"/>
+                <w:b w:val="false"/>
+                <w:bCs w:val="false"/>
+                <w:sz w:val="22"/>
+                <w:szCs w:val="22"/>
+              </w:rPr>
+              <w:t xml:space="preserve">Nothing</w:t>
+            </w:r>
+          </w:p>
+        </w:tc>
+        <w:tc>
+          <w:tcPr>
+            <w:tcW w:type="dxa" w:w="2560"/>
+            <w:tcBorders>
+              <w:top w:val="single" w:color="CCCCCC" w:sz="1"/>
+              <w:left w:val="single" w:color="CCCCCC" w:sz="1"/>
+              <w:bottom w:val="single" w:color="CCCCCC" w:sz="1"/>
+              <w:right w:val="single" w:color="CCCCCC" w:sz="1"/>
+            </w:tcBorders>
+            <w:tcMar>
+              <w:top w:type="dxa" w:w="80"/>
+              <w:left w:type="dxa" w:w="120"/>
+              <w:bottom w:type="dxa" w:w="80"/>
+              <w:right w:type="dxa" w:w="120"/>
+            </w:tcMar>
+          </w:tcPr>
+          <w:p>
+            <w:pPr>
+              <w:jc w:val="left"/>
+            </w:pPr>
+            <w:r>
+              <w:rPr>
+                <w:rFonts w:ascii="Arial" w:cs="Arial" w:eastAsia="Arial" w:hAnsi="Arial"/>
+                <w:b w:val="false"/>
+                <w:bCs w:val="false"/>
+                <w:sz w:val="22"/>
+                <w:szCs w:val="22"/>
+              </w:rPr>
+              <w:t xml:space="preserve">Default growth rates per asset class</w:t>
+            </w:r>
+          </w:p>
+        </w:tc>
+      </w:tr>
+      <w:tr>
+        <w:tc>
+          <w:tcPr>
+            <w:tcW w:type="dxa" w:w="3600"/>
+            <w:tcBorders>
+              <w:top w:val="single" w:color="CCCCCC" w:sz="1"/>
+              <w:left w:val="single" w:color="CCCCCC" w:sz="1"/>
+              <w:bottom w:val="single" w:color="CCCCCC" w:sz="1"/>
+              <w:right w:val="single" w:color="CCCCCC" w:sz="1"/>
+            </w:tcBorders>
+            <w:tcMar>
+              <w:top w:type="dxa" w:w="80"/>
+              <w:left w:type="dxa" w:w="120"/>
+              <w:bottom w:type="dxa" w:w="80"/>
+              <w:right w:type="dxa" w:w="120"/>
+            </w:tcMar>
+          </w:tcPr>
+          <w:p>
+            <w:pPr>
+              <w:jc w:val="left"/>
+            </w:pPr>
+            <w:r>
+              <w:rPr>
+                <w:rFonts w:ascii="Arial" w:cs="Arial" w:eastAsia="Arial" w:hAnsi="Arial"/>
+                <w:b w:val="false"/>
+                <w:bCs w:val="false"/>
+                <w:sz w:val="22"/>
+                <w:szCs w:val="22"/>
+              </w:rPr>
+              <w:t xml:space="preserve">PHASE-2-eis-engine-changes.md</w:t>
+            </w:r>
+          </w:p>
+        </w:tc>
+        <w:tc>
+          <w:tcPr>
+            <w:tcW w:type="dxa" w:w="1200"/>
+            <w:tcBorders>
+              <w:top w:val="single" w:color="CCCCCC" w:sz="1"/>
+              <w:left w:val="single" w:color="CCCCCC" w:sz="1"/>
+              <w:bottom w:val="single" w:color="CCCCCC" w:sz="1"/>
+              <w:right w:val="single" w:color="CCCCCC" w:sz="1"/>
+            </w:tcBorders>
+            <w:tcMar>
+              <w:top w:type="dxa" w:w="80"/>
+              <w:left w:type="dxa" w:w="120"/>
+              <w:bottom w:type="dxa" w:w="80"/>
+              <w:right w:type="dxa" w:w="120"/>
+            </w:tcMar>
+          </w:tcPr>
+          <w:p>
+            <w:pPr>
+              <w:jc w:val="left"/>
+            </w:pPr>
+            <w:r>
+              <w:rPr>
+                <w:rFonts w:ascii="Arial" w:cs="Arial" w:eastAsia="Arial" w:hAnsi="Arial"/>
+                <w:b w:val="false"/>
+                <w:bCs w:val="false"/>
+                <w:sz w:val="22"/>
+                <w:szCs w:val="22"/>
+              </w:rPr>
+              <w:t xml:space="preserve">2 days</w:t>
+            </w:r>
+          </w:p>
+        </w:tc>
+        <w:tc>
+          <w:tcPr>
+            <w:tcW w:type="dxa" w:w="2000"/>
+            <w:tcBorders>
+              <w:top w:val="single" w:color="CCCCCC" w:sz="1"/>
+              <w:left w:val="single" w:color="CCCCCC" w:sz="1"/>
+              <w:bottom w:val="single" w:color="CCCCCC" w:sz="1"/>
+              <w:right w:val="single" w:color="CCCCCC" w:sz="1"/>
+            </w:tcBorders>
+            <w:tcMar>
+              <w:top w:type="dxa" w:w="80"/>
+              <w:left w:type="dxa" w:w="120"/>
+              <w:bottom w:type="dxa" w:w="80"/>
+              <w:right w:type="dxa" w:w="120"/>
+            </w:tcMar>
+          </w:tcPr>
+          <w:p>
+            <w:pPr>
+              <w:jc w:val="left"/>
+            </w:pPr>
+            <w:r>
+              <w:rPr>
+                <w:rFonts w:ascii="Arial" w:cs="Arial" w:eastAsia="Arial" w:hAnsi="Arial"/>
+                <w:b w:val="false"/>
+                <w:bCs w:val="false"/>
+                <w:sz w:val="22"/>
+                <w:szCs w:val="22"/>
+              </w:rPr>
+              <w:t xml:space="preserve">Nothing</w:t>
+            </w:r>
+          </w:p>
+        </w:tc>
+        <w:tc>
+          <w:tcPr>
+            <w:tcW w:type="dxa" w:w="2560"/>
+            <w:tcBorders>
+              <w:top w:val="single" w:color="CCCCCC" w:sz="1"/>
+              <w:left w:val="single" w:color="CCCCCC" w:sz="1"/>
+              <w:bottom w:val="single" w:color="CCCCCC" w:sz="1"/>
+              <w:right w:val="single" w:color="CCCCCC" w:sz="1"/>
+            </w:tcBorders>
+            <w:tcMar>
+              <w:top w:type="dxa" w:w="80"/>
+              <w:left w:type="dxa" w:w="120"/>
+              <w:bottom w:type="dxa" w:w="80"/>
+              <w:right w:type="dxa" w:w="120"/>
+            </w:tcMar>
+          </w:tcPr>
+          <w:p>
+            <w:pPr>
+              <w:jc w:val="left"/>
+            </w:pPr>
+            <w:r>
+              <w:rPr>
+                <w:rFonts w:ascii="Arial" w:cs="Arial" w:eastAsia="Arial" w:hAnsi="Arial"/>
+                <w:b w:val="false"/>
+                <w:bCs w:val="false"/>
+                <w:sz w:val="22"/>
+                <w:szCs w:val="22"/>
+              </w:rPr>
+              <w:t xml:space="preserve">Remove EIS from drawdown, per-company model, loss formula</w:t>
+            </w:r>
+          </w:p>
+        </w:tc>
+      </w:tr>
+      <w:tr>
+        <w:tc>
+          <w:tcPr>
+            <w:tcW w:type="dxa" w:w="3600"/>
+            <w:tcBorders>
+              <w:top w:val="single" w:color="CCCCCC" w:sz="1"/>
+              <w:left w:val="single" w:color="CCCCCC" w:sz="1"/>
+              <w:bottom w:val="single" w:color="CCCCCC" w:sz="1"/>
+              <w:right w:val="single" w:color="CCCCCC" w:sz="1"/>
+            </w:tcBorders>
+            <w:tcMar>
+              <w:top w:type="dxa" w:w="80"/>
+              <w:left w:type="dxa" w:w="120"/>
+              <w:bottom w:type="dxa" w:w="80"/>
+              <w:right w:type="dxa" w:w="120"/>
+            </w:tcMar>
+          </w:tcPr>
+          <w:p>
+            <w:pPr>
+              <w:jc w:val="left"/>
+            </w:pPr>
+            <w:r>
+              <w:rPr>
+                <w:rFonts w:ascii="Arial" w:cs="Arial" w:eastAsia="Arial" w:hAnsi="Arial"/>
+                <w:b w:val="false"/>
+                <w:bCs w:val="false"/>
+                <w:sz w:val="22"/>
+                <w:szCs w:val="22"/>
+              </w:rPr>
+              <w:t xml:space="preserve">PHASE-3-eis-projection-panel.md</w:t>
+            </w:r>
+          </w:p>
+        </w:tc>
+        <w:tc>
+          <w:tcPr>
+            <w:tcW w:type="dxa" w:w="1200"/>
+            <w:tcBorders>
+              <w:top w:val="single" w:color="CCCCCC" w:sz="1"/>
+              <w:left w:val="single" w:color="CCCCCC" w:sz="1"/>
+              <w:bottom w:val="single" w:color="CCCCCC" w:sz="1"/>
+              <w:right w:val="single" w:color="CCCCCC" w:sz="1"/>
+            </w:tcBorders>
+            <w:tcMar>
+              <w:top w:type="dxa" w:w="80"/>
+              <w:left w:type="dxa" w:w="120"/>
+              <w:bottom w:type="dxa" w:w="80"/>
+              <w:right w:type="dxa" w:w="120"/>
+            </w:tcMar>
+          </w:tcPr>
+          <w:p>
+            <w:pPr>
+              <w:jc w:val="left"/>
+            </w:pPr>
+            <w:r>
+              <w:rPr>
+                <w:rFonts w:ascii="Arial" w:cs="Arial" w:eastAsia="Arial" w:hAnsi="Arial"/>
+                <w:b w:val="false"/>
+                <w:bCs w:val="false"/>
+                <w:sz w:val="22"/>
+                <w:szCs w:val="22"/>
+              </w:rPr>
+              <w:t xml:space="preserve">1–2 days</w:t>
+            </w:r>
+          </w:p>
+        </w:tc>
+        <w:tc>
+          <w:tcPr>
+            <w:tcW w:type="dxa" w:w="2000"/>
+            <w:tcBorders>
+              <w:top w:val="single" w:color="CCCCCC" w:sz="1"/>
+              <w:left w:val="single" w:color="CCCCCC" w:sz="1"/>
+              <w:bottom w:val="single" w:color="CCCCCC" w:sz="1"/>
+              <w:right w:val="single" w:color="CCCCCC" w:sz="1"/>
+            </w:tcBorders>
+            <w:tcMar>
+              <w:top w:type="dxa" w:w="80"/>
+              <w:left w:type="dxa" w:w="120"/>
+              <w:bottom w:type="dxa" w:w="80"/>
+              <w:right w:type="dxa" w:w="120"/>
+            </w:tcMar>
+          </w:tcPr>
+          <w:p>
+            <w:pPr>
+              <w:jc w:val="left"/>
+            </w:pPr>
+            <w:r>
+              <w:rPr>
+                <w:rFonts w:ascii="Arial" w:cs="Arial" w:eastAsia="Arial" w:hAnsi="Arial"/>
+                <w:b w:val="false"/>
+                <w:bCs w:val="false"/>
+                <w:sz w:val="22"/>
+                <w:szCs w:val="22"/>
+              </w:rPr>
+              <w:t xml:space="preserve">Phase 2</w:t>
+            </w:r>
+          </w:p>
+        </w:tc>
+        <w:tc>
+          <w:tcPr>
+            <w:tcW w:type="dxa" w:w="2560"/>
+            <w:tcBorders>
+              <w:top w:val="single" w:color="CCCCCC" w:sz="1"/>
+              <w:left w:val="single" w:color="CCCCCC" w:sz="1"/>
+              <w:bottom w:val="single" w:color="CCCCCC" w:sz="1"/>
+              <w:right w:val="single" w:color="CCCCCC" w:sz="1"/>
+            </w:tcBorders>
+            <w:tcMar>
+              <w:top w:type="dxa" w:w="80"/>
+              <w:left w:type="dxa" w:w="120"/>
+              <w:bottom w:type="dxa" w:w="80"/>
+              <w:right w:type="dxa" w:w="120"/>
+            </w:tcMar>
+          </w:tcPr>
+          <w:p>
+            <w:pPr>
+              <w:jc w:val="left"/>
+            </w:pPr>
+            <w:r>
+              <w:rPr>
+                <w:rFonts w:ascii="Arial" w:cs="Arial" w:eastAsia="Arial" w:hAnsi="Arial"/>
+                <w:b w:val="false"/>
+                <w:bCs w:val="false"/>
+                <w:sz w:val="22"/>
+                <w:szCs w:val="22"/>
+              </w:rPr>
+              <w:t xml:space="preserve">EIS projection chart, reinvestment, exit controls</w:t>
+            </w:r>
+          </w:p>
+        </w:tc>
+      </w:tr>
+      <w:tr>
+        <w:tc>
+          <w:tcPr>
+            <w:tcW w:type="dxa" w:w="3600"/>
+            <w:tcBorders>
+              <w:top w:val="single" w:color="CCCCCC" w:sz="1"/>
+              <w:left w:val="single" w:color="CCCCCC" w:sz="1"/>
+              <w:bottom w:val="single" w:color="CCCCCC" w:sz="1"/>
+              <w:right w:val="single" w:color="CCCCCC" w:sz="1"/>
+            </w:tcBorders>
+            <w:tcMar>
+              <w:top w:type="dxa" w:w="80"/>
+              <w:left w:type="dxa" w:w="120"/>
+              <w:bottom w:type="dxa" w:w="80"/>
+              <w:right w:type="dxa" w:w="120"/>
+            </w:tcMar>
+          </w:tcPr>
+          <w:p>
+            <w:pPr>
+              <w:jc w:val="left"/>
+            </w:pPr>
+            <w:r>
+              <w:rPr>
+                <w:rFonts w:ascii="Arial" w:cs="Arial" w:eastAsia="Arial" w:hAnsi="Arial"/>
+                <w:b w:val="false"/>
+                <w:bCs w:val="false"/>
+                <w:sz w:val="22"/>
+                <w:szCs w:val="22"/>
+              </w:rPr>
+              <w:t xml:space="preserve">PHASE-4-core-tensions.md</w:t>
+            </w:r>
+          </w:p>
+        </w:tc>
+        <w:tc>
+          <w:tcPr>
+            <w:tcW w:type="dxa" w:w="1200"/>
+            <w:tcBorders>
+              <w:top w:val="single" w:color="CCCCCC" w:sz="1"/>
+              <w:left w:val="single" w:color="CCCCCC" w:sz="1"/>
+              <w:bottom w:val="single" w:color="CCCCCC" w:sz="1"/>
+              <w:right w:val="single" w:color="CCCCCC" w:sz="1"/>
+            </w:tcBorders>
+            <w:tcMar>
+              <w:top w:type="dxa" w:w="80"/>
+              <w:left w:type="dxa" w:w="120"/>
+              <w:bottom w:type="dxa" w:w="80"/>
+              <w:right w:type="dxa" w:w="120"/>
+            </w:tcMar>
+          </w:tcPr>
+          <w:p>
+            <w:pPr>
+              <w:jc w:val="left"/>
+            </w:pPr>
+            <w:r>
+              <w:rPr>
+                <w:rFonts w:ascii="Arial" w:cs="Arial" w:eastAsia="Arial" w:hAnsi="Arial"/>
+                <w:b w:val="false"/>
+                <w:bCs w:val="false"/>
+                <w:sz w:val="22"/>
+                <w:szCs w:val="22"/>
+              </w:rPr>
+              <w:t xml:space="preserve">1–2 days</w:t>
+            </w:r>
+          </w:p>
+        </w:tc>
+        <w:tc>
+          <w:tcPr>
+            <w:tcW w:type="dxa" w:w="2000"/>
+            <w:tcBorders>
+              <w:top w:val="single" w:color="CCCCCC" w:sz="1"/>
+              <w:left w:val="single" w:color="CCCCCC" w:sz="1"/>
+              <w:bottom w:val="single" w:color="CCCCCC" w:sz="1"/>
+              <w:right w:val="single" w:color="CCCCCC" w:sz="1"/>
+            </w:tcBorders>
+            <w:tcMar>
+              <w:top w:type="dxa" w:w="80"/>
+              <w:left w:type="dxa" w:w="120"/>
+              <w:bottom w:type="dxa" w:w="80"/>
+              <w:right w:type="dxa" w:w="120"/>
+            </w:tcMar>
+          </w:tcPr>
+          <w:p>
+            <w:pPr>
+              <w:jc w:val="left"/>
+            </w:pPr>
+            <w:r>
+              <w:rPr>
+                <w:rFonts w:ascii="Arial" w:cs="Arial" w:eastAsia="Arial" w:hAnsi="Arial"/>
+                <w:b w:val="false"/>
+                <w:bCs w:val="false"/>
+                <w:sz w:val="22"/>
+                <w:szCs w:val="22"/>
+              </w:rPr>
+              <w:t xml:space="preserve">Nothing</w:t>
+            </w:r>
+          </w:p>
+        </w:tc>
+        <w:tc>
+          <w:tcPr>
+            <w:tcW w:type="dxa" w:w="2560"/>
+            <w:tcBorders>
+              <w:top w:val="single" w:color="CCCCCC" w:sz="1"/>
+              <w:left w:val="single" w:color="CCCCCC" w:sz="1"/>
+              <w:bottom w:val="single" w:color="CCCCCC" w:sz="1"/>
+              <w:right w:val="single" w:color="CCCCCC" w:sz="1"/>
+            </w:tcBorders>
+            <w:tcMar>
+              <w:top w:type="dxa" w:w="80"/>
+              <w:left w:type="dxa" w:w="120"/>
+              <w:bottom w:type="dxa" w:w="80"/>
+              <w:right w:type="dxa" w:w="120"/>
+            </w:tcMar>
+          </w:tcPr>
+          <w:p>
+            <w:pPr>
+              <w:jc w:val="left"/>
+            </w:pPr>
+            <w:r>
+              <w:rPr>
+                <w:rFonts w:ascii="Arial" w:cs="Arial" w:eastAsia="Arial" w:hAnsi="Arial"/>
+                <w:b w:val="false"/>
+                <w:bCs w:val="false"/>
+                <w:sz w:val="22"/>
+                <w:szCs w:val="22"/>
+              </w:rPr>
+              <w:t xml:space="preserve">Tension framework + 4 core tensions</w:t>
+            </w:r>
+          </w:p>
+        </w:tc>
+      </w:tr>
+      <w:tr>
+        <w:tc>
+          <w:tcPr>
+            <w:tcW w:type="dxa" w:w="3600"/>
+            <w:tcBorders>
+              <w:top w:val="single" w:color="CCCCCC" w:sz="1"/>
+              <w:left w:val="single" w:color="CCCCCC" w:sz="1"/>
+              <w:bottom w:val="single" w:color="CCCCCC" w:sz="1"/>
+              <w:right w:val="single" w:color="CCCCCC" w:sz="1"/>
+            </w:tcBorders>
+            <w:tcMar>
+              <w:top w:type="dxa" w:w="80"/>
+              <w:left w:type="dxa" w:w="120"/>
+              <w:bottom w:type="dxa" w:w="80"/>
+              <w:right w:type="dxa" w:w="120"/>
+            </w:tcMar>
+          </w:tcPr>
+          <w:p>
+            <w:pPr>
+              <w:jc w:val="left"/>
+            </w:pPr>
+            <w:r>
+              <w:rPr>
+                <w:rFonts w:ascii="Arial" w:cs="Arial" w:eastAsia="Arial" w:hAnsi="Arial"/>
+                <w:b w:val="false"/>
+                <w:bCs w:val="false"/>
+                <w:sz w:val="22"/>
+                <w:szCs w:val="22"/>
+              </w:rPr>
+              <w:t xml:space="preserve">PHASE-5-eis-and-advanced-tensions.md</w:t>
+            </w:r>
+          </w:p>
+        </w:tc>
+        <w:tc>
+          <w:tcPr>
+            <w:tcW w:type="dxa" w:w="1200"/>
+            <w:tcBorders>
+              <w:top w:val="single" w:color="CCCCCC" w:sz="1"/>
+              <w:left w:val="single" w:color="CCCCCC" w:sz="1"/>
+              <w:bottom w:val="single" w:color="CCCCCC" w:sz="1"/>
+              <w:right w:val="single" w:color="CCCCCC" w:sz="1"/>
+            </w:tcBorders>
+            <w:tcMar>
+              <w:top w:type="dxa" w:w="80"/>
+              <w:left w:type="dxa" w:w="120"/>
+              <w:bottom w:type="dxa" w:w="80"/>
+              <w:right w:type="dxa" w:w="120"/>
+            </w:tcMar>
+          </w:tcPr>
+          <w:p>
+            <w:pPr>
+              <w:jc w:val="left"/>
+            </w:pPr>
+            <w:r>
+              <w:rPr>
+                <w:rFonts w:ascii="Arial" w:cs="Arial" w:eastAsia="Arial" w:hAnsi="Arial"/>
+                <w:b w:val="false"/>
+                <w:bCs w:val="false"/>
+                <w:sz w:val="22"/>
+                <w:szCs w:val="22"/>
+              </w:rPr>
+              <w:t xml:space="preserve">1–2 days</w:t>
+            </w:r>
+          </w:p>
+        </w:tc>
+        <w:tc>
+          <w:tcPr>
+            <w:tcW w:type="dxa" w:w="2000"/>
+            <w:tcBorders>
+              <w:top w:val="single" w:color="CCCCCC" w:sz="1"/>
+              <w:left w:val="single" w:color="CCCCCC" w:sz="1"/>
+              <w:bottom w:val="single" w:color="CCCCCC" w:sz="1"/>
+              <w:right w:val="single" w:color="CCCCCC" w:sz="1"/>
+            </w:tcBorders>
+            <w:tcMar>
+              <w:top w:type="dxa" w:w="80"/>
+              <w:left w:type="dxa" w:w="120"/>
+              <w:bottom w:type="dxa" w:w="80"/>
+              <w:right w:type="dxa" w:w="120"/>
+            </w:tcMar>
+          </w:tcPr>
+          <w:p>
+            <w:pPr>
+              <w:jc w:val="left"/>
+            </w:pPr>
+            <w:r>
+              <w:rPr>
+                <w:rFonts w:ascii="Arial" w:cs="Arial" w:eastAsia="Arial" w:hAnsi="Arial"/>
+                <w:b/>
+                <w:bCs/>
+                <w:sz w:val="22"/>
+                <w:szCs w:val="22"/>
+              </w:rPr>
+              <w:t xml:space="preserve">Phases 2, 3, AND 4</w:t>
+            </w:r>
+          </w:p>
+        </w:tc>
+        <w:tc>
+          <w:tcPr>
+            <w:tcW w:type="dxa" w:w="2560"/>
+            <w:tcBorders>
+              <w:top w:val="single" w:color="CCCCCC" w:sz="1"/>
+              <w:left w:val="single" w:color="CCCCCC" w:sz="1"/>
+              <w:bottom w:val="single" w:color="CCCCCC" w:sz="1"/>
+              <w:right w:val="single" w:color="CCCCCC" w:sz="1"/>
+            </w:tcBorders>
+            <w:tcMar>
+              <w:top w:type="dxa" w:w="80"/>
+              <w:left w:type="dxa" w:w="120"/>
+              <w:bottom w:type="dxa" w:w="80"/>
+              <w:right w:type="dxa" w:w="120"/>
+            </w:tcMar>
+          </w:tcPr>
+          <w:p>
+            <w:pPr>
+              <w:jc w:val="left"/>
+            </w:pPr>
+            <w:r>
+              <w:rPr>
+                <w:rFonts w:ascii="Arial" w:cs="Arial" w:eastAsia="Arial" w:hAnsi="Arial"/>
+                <w:b w:val="false"/>
+                <w:bCs w:val="false"/>
+                <w:sz w:val="22"/>
+                <w:szCs w:val="22"/>
+              </w:rPr>
+              <w:t xml:space="preserve">Remaining 10 tensions</w:t>
+            </w:r>
+          </w:p>
+        </w:tc>
+      </w:tr>
+    </w:tbl>
+    <w:p>
+      <w:pPr>
+        <w:spacing w:after="160"/>
+        <w:jc w:val="left"/>
+      </w:pPr>
+      <w:r>
+        <w:rPr>
+          <w:rFonts w:ascii="Arial" w:cs="Arial" w:eastAsia="Arial" w:hAnsi="Arial"/>
+          <w:sz w:val="22"/>
+          <w:szCs w:val="22"/>
+        </w:rPr>
+        <w:t xml:space="preserve"/>
+      </w:r>
+    </w:p>
+    <w:p>
+      <w:pPr>
+        <w:pStyle w:val="Heading2"/>
+        <w:spacing w:after="160" w:before="240"/>
+      </w:pPr>
+      <w:r>
+        <w:rPr>
+          <w:rFonts w:ascii="Arial" w:cs="Arial" w:eastAsia="Arial" w:hAnsi="Arial"/>
+          <w:b/>
+          <w:bCs/>
+          <w:sz w:val="26"/>
+          <w:szCs w:val="26"/>
+        </w:rPr>
+        <w:t xml:space="preserve">The process</w:t>
+      </w:r>
+    </w:p>
+    <w:p>
+      <w:pPr>
+        <w:spacing w:after="160"/>
+        <w:jc w:val="left"/>
+      </w:pPr>
+      <w:r>
+        <w:rPr>
+          <w:rFonts w:ascii="Arial" w:cs="Arial" w:eastAsia="Arial" w:hAnsi="Arial"/>
+          <w:sz w:val="22"/>
+          <w:szCs w:val="22"/>
+        </w:rPr>
+        <w:t xml:space="preserve">For each phase:</w:t>
+      </w:r>
+    </w:p>
+    <w:p>
+      <w:pPr>
+        <w:pStyle w:val="ListParagraph"/>
+        <w:numPr>
+          <w:ilvl w:val="0"/>
+          <w:numId w:val="3"/>
+        </w:numPr>
+        <w:spacing w:after="80"/>
+      </w:pPr>
+      <w:r>
+        <w:rPr>
+          <w:rFonts w:ascii="Arial" w:cs="Arial" w:eastAsia="Arial" w:hAnsi="Arial"/>
+          <w:sz w:val="22"/>
+          <w:szCs w:val="22"/>
+        </w:rPr>
+        <w:t xml:space="preserve">Open a new Replit agent session</w:t>
+      </w:r>
+    </w:p>
+    <w:p>
+      <w:pPr>
+        <w:pStyle w:val="ListParagraph"/>
+        <w:numPr>
+          <w:ilvl w:val="0"/>
+          <w:numId w:val="3"/>
+        </w:numPr>
+        <w:spacing w:after="80"/>
+      </w:pPr>
+      <w:r>
+        <w:rPr>
+          <w:rFonts w:ascii="Arial" w:cs="Arial" w:eastAsia="Arial" w:hAnsi="Arial"/>
+          <w:sz w:val="22"/>
+          <w:szCs w:val="22"/>
+        </w:rPr>
+        <w:t xml:space="preserve">Give it this prompt: </w:t>
+      </w:r>
+      <w:r>
+        <w:rPr>
+          <w:rFonts w:ascii="Arial" w:cs="Arial" w:eastAsia="Arial" w:hAnsi="Arial"/>
+          <w:i/>
+          <w:iCs/>
+          <w:sz w:val="22"/>
+          <w:szCs w:val="22"/>
+        </w:rPr>
+        <w:t xml:space="preserve">"Read docs/phases/PHASE-X-name.md and implement it. Run the existing tests when done."</w:t>
+      </w:r>
+    </w:p>
+    <w:p>
+      <w:pPr>
+        <w:pStyle w:val="ListParagraph"/>
+        <w:numPr>
+          <w:ilvl w:val="0"/>
+          <w:numId w:val="3"/>
+        </w:numPr>
+        <w:spacing w:after="80"/>
+      </w:pPr>
+      <w:r>
+        <w:rPr>
+          <w:rFonts w:ascii="Arial" w:cs="Arial" w:eastAsia="Arial" w:hAnsi="Arial"/>
+          <w:sz w:val="22"/>
+          <w:szCs w:val="22"/>
+        </w:rPr>
+        <w:t xml:space="preserve">Let Replit work through it</w:t>
+      </w:r>
+    </w:p>
+    <w:p>
+      <w:pPr>
+        <w:pStyle w:val="ListParagraph"/>
+        <w:numPr>
+          <w:ilvl w:val="0"/>
+          <w:numId w:val="3"/>
+        </w:numPr>
+        <w:spacing w:after="80"/>
+      </w:pPr>
+      <w:r>
+        <w:rPr>
+          <w:rFonts w:ascii="Arial" w:cs="Arial" w:eastAsia="Arial" w:hAnsi="Arial"/>
+          <w:sz w:val="22"/>
+          <w:szCs w:val="22"/>
+        </w:rPr>
+        <w:t xml:space="preserve">Check the output against the acceptance criteria listed in the phase file</w:t>
+      </w:r>
+    </w:p>
+    <w:p>
+      <w:pPr>
+        <w:pStyle w:val="ListParagraph"/>
+        <w:numPr>
+          <w:ilvl w:val="0"/>
+          <w:numId w:val="3"/>
+        </w:numPr>
+        <w:spacing w:after="80"/>
+      </w:pPr>
+      <w:r>
+        <w:rPr>
+          <w:rFonts w:ascii="Arial" w:cs="Arial" w:eastAsia="Arial" w:hAnsi="Arial"/>
+          <w:sz w:val="22"/>
+          <w:szCs w:val="22"/>
+        </w:rPr>
+        <w:t xml:space="preserve">Only move to the next phase once you are satisfied</w:t>
+      </w:r>
+    </w:p>
+    <w:p>
+      <w:pPr>
+        <w:spacing w:after="160"/>
+        <w:jc w:val="left"/>
+      </w:pPr>
+      <w:r>
+        <w:rPr>
+          <w:rFonts w:ascii="Arial" w:cs="Arial" w:eastAsia="Arial" w:hAnsi="Arial"/>
+          <w:sz w:val="22"/>
+          <w:szCs w:val="22"/>
+        </w:rPr>
+        <w:t xml:space="preserve"/>
+      </w:r>
+    </w:p>
+    <w:p>
+      <w:pPr>
+        <w:spacing w:after="160"/>
+        <w:jc w:val="left"/>
+      </w:pPr>
+      <w:r>
+        <w:rPr>
+          <w:rFonts w:ascii="Arial" w:cs="Arial" w:eastAsia="Arial" w:hAnsi="Arial"/>
+          <w:b/>
+          <w:bCs/>
+          <w:sz w:val="22"/>
+          <w:szCs w:val="22"/>
+        </w:rPr>
+        <w:t xml:space="preserve">Do not give Replit all five files at once.</w:t>
+      </w:r>
+      <w:r>
+        <w:rPr>
+          <w:rFonts w:ascii="Arial" w:cs="Arial" w:eastAsia="Arial" w:hAnsi="Arial"/>
+          <w:sz w:val="22"/>
+          <w:szCs w:val="22"/>
+        </w:rPr>
+        <w:t xml:space="preserve"> It will try to do everything in one go and make a mess. One phase per session. Verify between phases. This is how you control the quality.</w:t>
+      </w:r>
+    </w:p>
+    <w:p>
+      <w:pPr>
+        <w:pStyle w:val="Heading2"/>
+        <w:spacing w:after="160" w:before="240"/>
+      </w:pPr>
+      <w:r>
+        <w:rPr>
+          <w:rFonts w:ascii="Arial" w:cs="Arial" w:eastAsia="Arial" w:hAnsi="Arial"/>
+          <w:b/>
+          <w:bCs/>
+          <w:sz w:val="26"/>
+          <w:szCs w:val="26"/>
+        </w:rPr>
+        <w:t xml:space="preserve">What can run in parallel</w:t>
+      </w:r>
+    </w:p>
+    <w:p>
+      <w:pPr>
+        <w:spacing w:after="160"/>
+        <w:jc w:val="left"/>
+      </w:pPr>
+      <w:r>
+        <w:rPr>
+          <w:rFonts w:ascii="Arial" w:cs="Arial" w:eastAsia="Arial" w:hAnsi="Arial"/>
+          <w:sz w:val="22"/>
+          <w:szCs w:val="22"/>
+        </w:rPr>
+        <w:t xml:space="preserve">Phases 1 and 4 are completely independent of each other. If you have the capacity, you can run them simultaneously in separate Replit sessions.</w:t>
+      </w:r>
+    </w:p>
+    <w:p>
+      <w:pPr>
+        <w:spacing w:after="160"/>
+        <w:jc w:val="left"/>
+      </w:pPr>
+      <w:r>
+        <w:rPr>
+          <w:rFonts w:ascii="Arial" w:cs="Arial" w:eastAsia="Arial" w:hAnsi="Arial"/>
+          <w:b/>
+          <w:bCs/>
+          <w:sz w:val="22"/>
+          <w:szCs w:val="22"/>
+        </w:rPr>
+        <w:t xml:space="preserve">Phase 5 is the critical gate.</w:t>
+      </w:r>
+      <w:r>
+        <w:rPr>
+          <w:rFonts w:ascii="Arial" w:cs="Arial" w:eastAsia="Arial" w:hAnsi="Arial"/>
+          <w:sz w:val="22"/>
+          <w:szCs w:val="22"/>
+        </w:rPr>
+        <w:t xml:space="preserve"> It depends on Phases 2, 3, and 4 all being complete and verified. Nine of the ten tensions in Phase 5 reference EIS behaviour from the new model. If the EIS rework is not done correctly, those tensions will produce wrong numbers and you will have to rebuild them.</w:t>
+      </w:r>
+    </w:p>
+    <w:p>
+      <w:pPr>
+        <w:pStyle w:val="Heading2"/>
+        <w:spacing w:after="160" w:before="240"/>
+      </w:pPr>
+      <w:r>
+        <w:rPr>
+          <w:rFonts w:ascii="Arial" w:cs="Arial" w:eastAsia="Arial" w:hAnsi="Arial"/>
+          <w:b/>
+          <w:bCs/>
+          <w:sz w:val="26"/>
+          <w:szCs w:val="26"/>
+        </w:rPr>
+        <w:t xml:space="preserve">What to look for when verifying</w:t>
+      </w:r>
+    </w:p>
+    <w:p>
+      <w:pPr>
+        <w:spacing w:after="160"/>
+        <w:jc w:val="left"/>
+      </w:pPr>
+      <w:r>
+        <w:rPr>
+          <w:rFonts w:ascii="Arial" w:cs="Arial" w:eastAsia="Arial" w:hAnsi="Arial"/>
+          <w:sz w:val="22"/>
+          <w:szCs w:val="22"/>
+        </w:rPr>
+        <w:t xml:space="preserve">Each phase file has an “Acceptance criteria” section with specific, testable statements. Go through them one by one. If any fail, tell Replit what failed and let it fix before moving on.</w:t>
+      </w:r>
+    </w:p>
+    <w:p>
+      <w:pPr>
+        <w:spacing w:after="160"/>
+        <w:jc w:val="left"/>
+      </w:pPr>
+      <w:r>
+        <w:rPr>
+          <w:rFonts w:ascii="Arial" w:cs="Arial" w:eastAsia="Arial" w:hAnsi="Arial"/>
+          <w:sz w:val="22"/>
+          <w:szCs w:val="22"/>
+        </w:rPr>
+        <w:t xml:space="preserve">After Phase 2 in particular, run the existing 178-test engine suite (docs/engine-matrix.test.ts). Some EIS-related tests will need updating because the model has fundamentally changed — that is expected. But non-EIS tests should all still pass.</w:t>
       </w:r>
     </w:p>
     <w:p>

</xml_diff>